<commit_message>
2026-08-07 | 산출물 수정
</commit_message>
<xml_diff>
--- a/docs/individual/dongyoon/산출물/AI_ML_DL_학습결과서_대체_사전학습모델_선정검증_v1.0.docx
+++ b/docs/individual/dongyoon/산출물/AI_ML_DL_학습결과서_대체_사전학습모델_선정검증_v1.0.docx
@@ -8943,6 +8943,871 @@
                 <w:szCs w:val="20"/>
               </w:rPr>
               <w:t>누수 질의 순위 개선 여부 검증</w:t>
+            </w:r>
+          </w:p>
+        </w:tc>
+      </w:tr>
+    </w:tbl>
+    <w:p>
+      <w:pPr>
+        <w:numPr>
+          <w:ilvl w:val="0"/>
+          <w:numId w:val="3"/>
+        </w:numPr>
+        <w:spacing w:line="276" w:lineRule="auto"/>
+        <w:ind w:left="720" w:hanging="360"/>
+        <w:rPr>
+          <w:rFonts w:ascii="Malgun Gothic" w:cs="Malgun Gothic" w:eastAsia="Malgun Gothic" w:hAnsi="Malgun Gothic"/>
+          <w:sz w:val="26"/>
+          <w:szCs w:val="26"/>
+        </w:rPr>
+        <w:pageBreakBefore/>
+      </w:pPr>
+      <w:r>
+        <w:rPr>
+          <w:rFonts w:ascii="Malgun Gothic" w:cs="Malgun Gothic" w:eastAsia="Malgun Gothic" w:hAnsi="Malgun Gothic"/>
+          <w:sz w:val="26"/>
+          <w:szCs w:val="26"/>
+          <w:rtl w:val="0"/>
+        </w:rPr>
+        <w:t>변경 이력 및 제출 전략</w:t>
+      </w:r>
+      <w:r>
+        <w:rPr>
+          <w:rtl w:val="0"/>
+        </w:rPr>
+      </w:r>
+    </w:p>
+    <w:tbl>
+      <w:tblPr>
+        <w:tblStyle w:val="Table8"/>
+        <w:tblW w:w="9000.0" w:type="dxa"/>
+        <w:jc w:val="left"/>
+        <w:tblInd w:w="566.9291338582677" w:type="dxa"/>
+        <w:tblBorders>
+          <w:top w:color="000000" w:space="0" w:sz="8" w:val="single"/>
+          <w:left w:color="000000" w:space="0" w:sz="8" w:val="single"/>
+          <w:bottom w:color="000000" w:space="0" w:sz="8" w:val="single"/>
+          <w:right w:color="000000" w:space="0" w:sz="8" w:val="single"/>
+          <w:insideH w:color="000000" w:space="0" w:sz="8" w:val="single"/>
+          <w:insideV w:color="000000" w:space="0" w:sz="8" w:val="single"/>
+        </w:tblBorders>
+        <w:tblLayout w:type="fixed"/>
+        <w:tblLook w:val="0600"/>
+      </w:tblPr>
+      <w:tblGrid>
+        <w:gridCol w:w="1485"/>
+        <w:gridCol w:w="1200"/>
+        <w:gridCol w:w="2895"/>
+        <w:gridCol w:w="1890"/>
+        <w:gridCol w:w="1530"/>
+        <w:tblGridChange w:id="0">
+          <w:tblGrid>
+            <w:gridCol w:w="1485"/>
+            <w:gridCol w:w="1200"/>
+            <w:gridCol w:w="2895"/>
+            <w:gridCol w:w="1890"/>
+            <w:gridCol w:w="1530"/>
+          </w:tblGrid>
+        </w:tblGridChange>
+      </w:tblGrid>
+      <w:tr>
+        <w:trPr>
+          <w:cantSplit w:val="0"/>
+          <w:tblHeader w:val="0"/>
+        </w:trPr>
+        <w:tc>
+          <w:tcPr>
+            <w:tcBorders>
+              <w:top w:color="cccccc" w:space="0" w:sz="8" w:val="single"/>
+              <w:left w:color="cccccc" w:space="0" w:sz="8" w:val="single"/>
+              <w:bottom w:color="cccccc" w:space="0" w:sz="8" w:val="single"/>
+              <w:right w:color="cccccc" w:space="0" w:sz="8" w:val="single"/>
+            </w:tcBorders>
+            <w:shd w:fill="cfe2f3" w:val="clear"/>
+            <w:tcMar>
+              <w:top w:w="100.0" w:type="dxa"/>
+              <w:left w:w="100.0" w:type="dxa"/>
+              <w:bottom w:w="100.0" w:type="dxa"/>
+              <w:right w:w="100.0" w:type="dxa"/>
+            </w:tcMar>
+            <w:vAlign w:val="top"/>
+          </w:tcPr>
+          <w:p>
+            <w:pPr>
+              <w:widowControl w:val="0"/>
+              <w:spacing w:line="276" w:lineRule="auto"/>
+              <w:jc w:val="center"/>
+              <w:rPr>
+                <w:rFonts w:ascii="Malgun Gothic" w:cs="Malgun Gothic" w:eastAsia="Malgun Gothic" w:hAnsi="Malgun Gothic"/>
+                <w:sz w:val="20"/>
+                <w:szCs w:val="20"/>
+              </w:rPr>
+            </w:pPr>
+            <w:r>
+              <w:rPr>
+                <w:rFonts w:ascii="Malgun Gothic" w:cs="Malgun Gothic" w:eastAsia="Malgun Gothic" w:hAnsi="Malgun Gothic"/>
+                <w:sz w:val="20"/>
+                <w:szCs w:val="20"/>
+                <w:rtl w:val="0"/>
+              </w:rPr>
+              <w:t>변경일</w:t>
+            </w:r>
+          </w:p>
+        </w:tc>
+        <w:tc>
+          <w:tcPr>
+            <w:tcBorders>
+              <w:top w:color="cccccc" w:space="0" w:sz="8" w:val="single"/>
+              <w:left w:color="cccccc" w:space="0" w:sz="8" w:val="single"/>
+              <w:bottom w:color="cccccc" w:space="0" w:sz="8" w:val="single"/>
+              <w:right w:color="cccccc" w:space="0" w:sz="8" w:val="single"/>
+            </w:tcBorders>
+            <w:shd w:fill="cfe2f3" w:val="clear"/>
+            <w:tcMar>
+              <w:top w:w="100.0" w:type="dxa"/>
+              <w:left w:w="100.0" w:type="dxa"/>
+              <w:bottom w:w="100.0" w:type="dxa"/>
+              <w:right w:w="100.0" w:type="dxa"/>
+            </w:tcMar>
+            <w:vAlign w:val="top"/>
+          </w:tcPr>
+          <w:p>
+            <w:pPr>
+              <w:widowControl w:val="0"/>
+              <w:spacing w:line="276" w:lineRule="auto"/>
+              <w:jc w:val="center"/>
+              <w:rPr>
+                <w:rFonts w:ascii="Malgun Gothic" w:cs="Malgun Gothic" w:eastAsia="Malgun Gothic" w:hAnsi="Malgun Gothic"/>
+                <w:sz w:val="20"/>
+                <w:szCs w:val="20"/>
+              </w:rPr>
+            </w:pPr>
+            <w:r>
+              <w:rPr>
+                <w:rFonts w:ascii="Malgun Gothic" w:cs="Malgun Gothic" w:eastAsia="Malgun Gothic" w:hAnsi="Malgun Gothic"/>
+                <w:sz w:val="20"/>
+                <w:szCs w:val="20"/>
+                <w:rtl w:val="0"/>
+              </w:rPr>
+              <w:t>변경자</w:t>
+            </w:r>
+          </w:p>
+        </w:tc>
+        <w:tc>
+          <w:tcPr>
+            <w:tcBorders>
+              <w:top w:color="cccccc" w:space="0" w:sz="8" w:val="single"/>
+              <w:left w:color="cccccc" w:space="0" w:sz="8" w:val="single"/>
+              <w:bottom w:color="cccccc" w:space="0" w:sz="8" w:val="single"/>
+              <w:right w:color="cccccc" w:space="0" w:sz="8" w:val="single"/>
+            </w:tcBorders>
+            <w:shd w:fill="cfe2f3" w:val="clear"/>
+            <w:tcMar>
+              <w:top w:w="100.0" w:type="dxa"/>
+              <w:left w:w="100.0" w:type="dxa"/>
+              <w:bottom w:w="100.0" w:type="dxa"/>
+              <w:right w:w="100.0" w:type="dxa"/>
+            </w:tcMar>
+            <w:vAlign w:val="top"/>
+          </w:tcPr>
+          <w:p>
+            <w:pPr>
+              <w:widowControl w:val="0"/>
+              <w:spacing w:line="276" w:lineRule="auto"/>
+              <w:jc w:val="center"/>
+              <w:rPr>
+                <w:rFonts w:ascii="Malgun Gothic" w:cs="Malgun Gothic" w:eastAsia="Malgun Gothic" w:hAnsi="Malgun Gothic"/>
+                <w:sz w:val="20"/>
+                <w:szCs w:val="20"/>
+              </w:rPr>
+            </w:pPr>
+            <w:r>
+              <w:rPr>
+                <w:rFonts w:ascii="Malgun Gothic" w:cs="Malgun Gothic" w:eastAsia="Malgun Gothic" w:hAnsi="Malgun Gothic"/>
+                <w:sz w:val="20"/>
+                <w:szCs w:val="20"/>
+                <w:rtl w:val="0"/>
+              </w:rPr>
+              <w:t>변경내용</w:t>
+            </w:r>
+          </w:p>
+        </w:tc>
+        <w:tc>
+          <w:tcPr>
+            <w:tcBorders>
+              <w:top w:color="cccccc" w:space="0" w:sz="8" w:val="single"/>
+              <w:left w:color="cccccc" w:space="0" w:sz="8" w:val="single"/>
+              <w:bottom w:color="cccccc" w:space="0" w:sz="8" w:val="single"/>
+              <w:right w:color="cccccc" w:space="0" w:sz="8" w:val="single"/>
+            </w:tcBorders>
+            <w:shd w:fill="cfe2f3" w:val="clear"/>
+            <w:tcMar>
+              <w:top w:w="100.0" w:type="dxa"/>
+              <w:left w:w="100.0" w:type="dxa"/>
+              <w:bottom w:w="100.0" w:type="dxa"/>
+              <w:right w:w="100.0" w:type="dxa"/>
+            </w:tcMar>
+            <w:vAlign w:val="top"/>
+          </w:tcPr>
+          <w:p>
+            <w:pPr>
+              <w:keepNext w:val="0"/>
+              <w:keepLines w:val="0"/>
+              <w:widowControl w:val="0"/>
+              <w:pBdr>
+                <w:top w:space="0" w:sz="0" w:val="nil"/>
+                <w:left w:space="0" w:sz="0" w:val="nil"/>
+                <w:bottom w:space="0" w:sz="0" w:val="nil"/>
+                <w:right w:space="0" w:sz="0" w:val="nil"/>
+                <w:between w:space="0" w:sz="0" w:val="nil"/>
+              </w:pBdr>
+              <w:shd w:fill="auto" w:val="clear"/>
+              <w:spacing w:after="0" w:before="0" w:line="276" w:lineRule="auto"/>
+              <w:ind w:left="0" w:right="0" w:firstLine="0"/>
+              <w:jc w:val="center"/>
+              <w:rPr>
+                <w:rFonts w:ascii="Malgun Gothic" w:cs="Malgun Gothic" w:eastAsia="Malgun Gothic" w:hAnsi="Malgun Gothic"/>
+                <w:sz w:val="20"/>
+                <w:szCs w:val="20"/>
+              </w:rPr>
+            </w:pPr>
+            <w:r>
+              <w:rPr>
+                <w:rFonts w:ascii="Malgun Gothic" w:cs="Malgun Gothic" w:eastAsia="Malgun Gothic" w:hAnsi="Malgun Gothic"/>
+                <w:sz w:val="20"/>
+                <w:szCs w:val="20"/>
+                <w:rtl w:val="0"/>
+              </w:rPr>
+              <w:t>영향 받는 항목</w:t>
+            </w:r>
+          </w:p>
+        </w:tc>
+        <w:tc>
+          <w:tcPr>
+            <w:tcBorders>
+              <w:top w:color="cccccc" w:space="0" w:sz="8" w:val="single"/>
+              <w:left w:color="cccccc" w:space="0" w:sz="8" w:val="single"/>
+              <w:bottom w:color="cccccc" w:space="0" w:sz="8" w:val="single"/>
+              <w:right w:color="cccccc" w:space="0" w:sz="8" w:val="single"/>
+            </w:tcBorders>
+            <w:shd w:fill="cfe2f3" w:val="clear"/>
+            <w:tcMar>
+              <w:top w:w="100.0" w:type="dxa"/>
+              <w:left w:w="100.0" w:type="dxa"/>
+              <w:bottom w:w="100.0" w:type="dxa"/>
+              <w:right w:w="100.0" w:type="dxa"/>
+            </w:tcMar>
+            <w:vAlign w:val="top"/>
+          </w:tcPr>
+          <w:p>
+            <w:pPr>
+              <w:keepNext w:val="0"/>
+              <w:keepLines w:val="0"/>
+              <w:widowControl w:val="0"/>
+              <w:pBdr>
+                <w:top w:space="0" w:sz="0" w:val="nil"/>
+                <w:left w:space="0" w:sz="0" w:val="nil"/>
+                <w:bottom w:space="0" w:sz="0" w:val="nil"/>
+                <w:right w:space="0" w:sz="0" w:val="nil"/>
+                <w:between w:space="0" w:sz="0" w:val="nil"/>
+              </w:pBdr>
+              <w:shd w:fill="auto" w:val="clear"/>
+              <w:spacing w:after="0" w:before="0" w:line="276" w:lineRule="auto"/>
+              <w:ind w:left="0" w:right="0" w:firstLine="0"/>
+              <w:jc w:val="center"/>
+              <w:rPr>
+                <w:rFonts w:ascii="Malgun Gothic" w:cs="Malgun Gothic" w:eastAsia="Malgun Gothic" w:hAnsi="Malgun Gothic"/>
+                <w:sz w:val="20"/>
+                <w:szCs w:val="20"/>
+              </w:rPr>
+            </w:pPr>
+            <w:r>
+              <w:rPr>
+                <w:rFonts w:ascii="Malgun Gothic" w:cs="Malgun Gothic" w:eastAsia="Malgun Gothic" w:hAnsi="Malgun Gothic"/>
+                <w:sz w:val="20"/>
+                <w:szCs w:val="20"/>
+                <w:rtl w:val="0"/>
+              </w:rPr>
+              <w:t>비고</w:t>
+            </w:r>
+          </w:p>
+        </w:tc>
+      </w:tr>
+      <w:tr>
+        <w:trPr>
+          <w:cantSplit w:val="0"/>
+          <w:tblHeader w:val="0"/>
+        </w:trPr>
+        <w:tc>
+          <w:tcPr>
+            <w:tcBorders>
+              <w:top w:color="cccccc" w:space="0" w:sz="8" w:val="single"/>
+              <w:left w:color="cccccc" w:space="0" w:sz="8" w:val="single"/>
+              <w:bottom w:color="cccccc" w:space="0" w:sz="8" w:val="single"/>
+              <w:right w:color="cccccc" w:space="0" w:sz="8" w:val="single"/>
+            </w:tcBorders>
+            <w:shd w:fill="auto" w:val="clear"/>
+            <w:tcMar>
+              <w:top w:w="100.0" w:type="dxa"/>
+              <w:left w:w="100.0" w:type="dxa"/>
+              <w:bottom w:w="100.0" w:type="dxa"/>
+              <w:right w:w="100.0" w:type="dxa"/>
+            </w:tcMar>
+            <w:vAlign w:val="top"/>
+          </w:tcPr>
+          <w:p>
+            <w:pPr>
+              <w:keepNext w:val="0"/>
+              <w:keepLines w:val="0"/>
+              <w:widowControl w:val="0"/>
+              <w:pBdr>
+                <w:top w:space="0" w:sz="0" w:val="nil"/>
+                <w:left w:space="0" w:sz="0" w:val="nil"/>
+                <w:bottom w:space="0" w:sz="0" w:val="nil"/>
+                <w:right w:space="0" w:sz="0" w:val="nil"/>
+                <w:between w:space="0" w:sz="0" w:val="nil"/>
+              </w:pBdr>
+              <w:shd w:fill="auto" w:val="clear"/>
+              <w:spacing w:after="0" w:before="0" w:line="276" w:lineRule="auto"/>
+              <w:ind w:left="0" w:right="0" w:firstLine="0"/>
+              <w:jc w:val="center"/>
+              <w:rPr>
+                <w:rFonts w:ascii="Malgun Gothic" w:cs="Malgun Gothic" w:eastAsia="Malgun Gothic" w:hAnsi="Malgun Gothic"/>
+                <w:b w:val="0"/>
+                <w:bCs w:val="0"/>
+                <w:color w:val="0000ff"/>
+                <w:sz w:val="20"/>
+                <w:szCs w:val="20"/>
+              </w:rPr>
+            </w:pPr>
+            <w:r>
+              <w:rPr>
+                <w:rFonts w:ascii="Malgun Gothic" w:cs="Malgun Gothic" w:eastAsia="Malgun Gothic" w:hAnsi="Malgun Gothic"/>
+                <w:b w:val="0"/>
+                <w:bCs w:val="0"/>
+                <w:color w:val="0000ff"/>
+                <w:sz w:val="20"/>
+                <w:szCs w:val="20"/>
+                <w:rtl w:val="0"/>
+              </w:rPr>
+              <w:t>2026.08.06</w:t>
+            </w:r>
+          </w:p>
+        </w:tc>
+        <w:tc>
+          <w:tcPr>
+            <w:tcBorders>
+              <w:top w:color="cccccc" w:space="0" w:sz="8" w:val="single"/>
+              <w:left w:color="cccccc" w:space="0" w:sz="8" w:val="single"/>
+              <w:bottom w:color="cccccc" w:space="0" w:sz="8" w:val="single"/>
+              <w:right w:color="cccccc" w:space="0" w:sz="8" w:val="single"/>
+            </w:tcBorders>
+            <w:shd w:fill="auto" w:val="clear"/>
+            <w:tcMar>
+              <w:top w:w="100.0" w:type="dxa"/>
+              <w:left w:w="100.0" w:type="dxa"/>
+              <w:bottom w:w="100.0" w:type="dxa"/>
+              <w:right w:w="100.0" w:type="dxa"/>
+            </w:tcMar>
+            <w:vAlign w:val="top"/>
+          </w:tcPr>
+          <w:p>
+            <w:pPr>
+              <w:keepNext w:val="0"/>
+              <w:keepLines w:val="0"/>
+              <w:widowControl w:val="0"/>
+              <w:pBdr>
+                <w:top w:space="0" w:sz="0" w:val="nil"/>
+                <w:left w:space="0" w:sz="0" w:val="nil"/>
+                <w:bottom w:space="0" w:sz="0" w:val="nil"/>
+                <w:right w:space="0" w:sz="0" w:val="nil"/>
+                <w:between w:space="0" w:sz="0" w:val="nil"/>
+              </w:pBdr>
+              <w:shd w:fill="auto" w:val="clear"/>
+              <w:spacing w:after="0" w:before="0" w:line="276" w:lineRule="auto"/>
+              <w:ind w:left="0" w:right="0" w:firstLine="0"/>
+              <w:jc w:val="center"/>
+              <w:rPr>
+                <w:rFonts w:ascii="Malgun Gothic" w:cs="Malgun Gothic" w:eastAsia="Malgun Gothic" w:hAnsi="Malgun Gothic"/>
+                <w:b w:val="0"/>
+                <w:bCs w:val="0"/>
+                <w:color w:val="0000ff"/>
+                <w:sz w:val="20"/>
+                <w:szCs w:val="20"/>
+              </w:rPr>
+            </w:pPr>
+            <w:r>
+              <w:rPr>
+                <w:rFonts w:ascii="Malgun Gothic" w:cs="Malgun Gothic" w:eastAsia="Malgun Gothic" w:hAnsi="Malgun Gothic"/>
+                <w:b w:val="0"/>
+                <w:bCs w:val="0"/>
+                <w:color w:val="0000ff"/>
+                <w:sz w:val="20"/>
+                <w:szCs w:val="20"/>
+                <w:rtl w:val="0"/>
+              </w:rPr>
+              <w:t>이동윤</w:t>
+            </w:r>
+          </w:p>
+        </w:tc>
+        <w:tc>
+          <w:tcPr>
+            <w:tcBorders>
+              <w:top w:color="cccccc" w:space="0" w:sz="8" w:val="single"/>
+              <w:left w:color="cccccc" w:space="0" w:sz="8" w:val="single"/>
+              <w:bottom w:color="cccccc" w:space="0" w:sz="8" w:val="single"/>
+              <w:right w:color="cccccc" w:space="0" w:sz="8" w:val="single"/>
+            </w:tcBorders>
+            <w:shd w:fill="auto" w:val="clear"/>
+            <w:tcMar>
+              <w:top w:w="100.0" w:type="dxa"/>
+              <w:left w:w="100.0" w:type="dxa"/>
+              <w:bottom w:w="100.0" w:type="dxa"/>
+              <w:right w:w="100.0" w:type="dxa"/>
+            </w:tcMar>
+            <w:vAlign w:val="top"/>
+          </w:tcPr>
+          <w:p>
+            <w:pPr>
+              <w:keepNext w:val="0"/>
+              <w:keepLines w:val="0"/>
+              <w:widowControl w:val="0"/>
+              <w:pBdr>
+                <w:top w:space="0" w:sz="0" w:val="nil"/>
+                <w:left w:space="0" w:sz="0" w:val="nil"/>
+                <w:bottom w:space="0" w:sz="0" w:val="nil"/>
+                <w:right w:space="0" w:sz="0" w:val="nil"/>
+                <w:between w:space="0" w:sz="0" w:val="nil"/>
+              </w:pBdr>
+              <w:shd w:fill="auto" w:val="clear"/>
+              <w:spacing w:after="0" w:before="0" w:line="276" w:lineRule="auto"/>
+              <w:ind w:left="0" w:right="0" w:firstLine="0"/>
+              <w:jc w:val="center"/>
+              <w:rPr>
+                <w:rFonts w:ascii="Malgun Gothic" w:cs="Malgun Gothic" w:eastAsia="Malgun Gothic" w:hAnsi="Malgun Gothic"/>
+                <w:b w:val="0"/>
+                <w:bCs w:val="0"/>
+                <w:color w:val="0000ff"/>
+                <w:sz w:val="20"/>
+                <w:szCs w:val="20"/>
+              </w:rPr>
+            </w:pPr>
+            <w:r>
+              <w:rPr>
+                <w:rFonts w:ascii="Malgun Gothic" w:cs="Malgun Gothic" w:eastAsia="Malgun Gothic" w:hAnsi="Malgun Gothic"/>
+                <w:b w:val="0"/>
+                <w:bCs w:val="0"/>
+                <w:color w:val="0000ff"/>
+                <w:sz w:val="20"/>
+                <w:szCs w:val="20"/>
+                <w:rtl w:val="0"/>
+              </w:rPr>
+              <w:t>상세 결과서에서 ML/DL 대체 산출물 분리</w:t>
+            </w:r>
+          </w:p>
+        </w:tc>
+        <w:tc>
+          <w:tcPr>
+            <w:tcBorders>
+              <w:top w:color="cccccc" w:space="0" w:sz="8" w:val="single"/>
+              <w:left w:color="cccccc" w:space="0" w:sz="8" w:val="single"/>
+              <w:bottom w:color="cccccc" w:space="0" w:sz="8" w:val="single"/>
+              <w:right w:color="cccccc" w:space="0" w:sz="8" w:val="single"/>
+            </w:tcBorders>
+            <w:shd w:fill="auto" w:val="clear"/>
+            <w:tcMar>
+              <w:top w:w="100.0" w:type="dxa"/>
+              <w:left w:w="100.0" w:type="dxa"/>
+              <w:bottom w:w="100.0" w:type="dxa"/>
+              <w:right w:w="100.0" w:type="dxa"/>
+            </w:tcMar>
+            <w:vAlign w:val="top"/>
+          </w:tcPr>
+          <w:p>
+            <w:pPr>
+              <w:keepNext w:val="0"/>
+              <w:keepLines w:val="0"/>
+              <w:widowControl w:val="0"/>
+              <w:pBdr>
+                <w:top w:space="0" w:sz="0" w:val="nil"/>
+                <w:left w:space="0" w:sz="0" w:val="nil"/>
+                <w:bottom w:space="0" w:sz="0" w:val="nil"/>
+                <w:right w:space="0" w:sz="0" w:val="nil"/>
+                <w:between w:space="0" w:sz="0" w:val="nil"/>
+              </w:pBdr>
+              <w:shd w:fill="auto" w:val="clear"/>
+              <w:spacing w:after="0" w:before="0" w:line="276" w:lineRule="auto"/>
+              <w:ind w:left="0" w:right="0" w:firstLine="0"/>
+              <w:jc w:val="center"/>
+              <w:rPr>
+                <w:rFonts w:ascii="Malgun Gothic" w:cs="Malgun Gothic" w:eastAsia="Malgun Gothic" w:hAnsi="Malgun Gothic"/>
+                <w:b w:val="0"/>
+                <w:bCs w:val="0"/>
+                <w:color w:val="0000ff"/>
+                <w:sz w:val="20"/>
+                <w:szCs w:val="20"/>
+              </w:rPr>
+            </w:pPr>
+            <w:r>
+              <w:rPr>
+                <w:rFonts w:ascii="Malgun Gothic" w:cs="Malgun Gothic" w:eastAsia="Malgun Gothic" w:hAnsi="Malgun Gothic"/>
+                <w:b w:val="0"/>
+                <w:bCs w:val="0"/>
+                <w:color w:val="0000ff"/>
+                <w:sz w:val="20"/>
+                <w:szCs w:val="20"/>
+                <w:rtl w:val="0"/>
+              </w:rPr>
+              <w:t>전체</w:t>
+            </w:r>
+          </w:p>
+        </w:tc>
+        <w:tc>
+          <w:tcPr>
+            <w:tcBorders>
+              <w:top w:color="cccccc" w:space="0" w:sz="8" w:val="single"/>
+              <w:left w:color="cccccc" w:space="0" w:sz="8" w:val="single"/>
+              <w:bottom w:color="cccccc" w:space="0" w:sz="8" w:val="single"/>
+              <w:right w:color="cccccc" w:space="0" w:sz="8" w:val="single"/>
+            </w:tcBorders>
+            <w:shd w:fill="auto" w:val="clear"/>
+            <w:tcMar>
+              <w:top w:w="100.0" w:type="dxa"/>
+              <w:left w:w="100.0" w:type="dxa"/>
+              <w:bottom w:w="100.0" w:type="dxa"/>
+              <w:right w:w="100.0" w:type="dxa"/>
+            </w:tcMar>
+            <w:vAlign w:val="top"/>
+          </w:tcPr>
+          <w:p>
+            <w:pPr>
+              <w:keepNext w:val="0"/>
+              <w:keepLines w:val="0"/>
+              <w:widowControl w:val="0"/>
+              <w:pBdr>
+                <w:top w:space="0" w:sz="0" w:val="nil"/>
+                <w:left w:space="0" w:sz="0" w:val="nil"/>
+                <w:bottom w:space="0" w:sz="0" w:val="nil"/>
+                <w:right w:space="0" w:sz="0" w:val="nil"/>
+                <w:between w:space="0" w:sz="0" w:val="nil"/>
+              </w:pBdr>
+              <w:shd w:fill="auto" w:val="clear"/>
+              <w:spacing w:after="0" w:before="0" w:line="276" w:lineRule="auto"/>
+              <w:ind w:left="0" w:right="0" w:firstLine="0"/>
+              <w:jc w:val="center"/>
+              <w:rPr>
+                <w:rFonts w:ascii="Malgun Gothic" w:cs="Malgun Gothic" w:eastAsia="Malgun Gothic" w:hAnsi="Malgun Gothic"/>
+                <w:b w:val="0"/>
+                <w:bCs w:val="0"/>
+                <w:color w:val="0000ff"/>
+                <w:sz w:val="20"/>
+                <w:szCs w:val="20"/>
+              </w:rPr>
+            </w:pPr>
+            <w:r>
+              <w:rPr>
+                <w:rFonts w:ascii="Malgun Gothic" w:cs="Malgun Gothic" w:eastAsia="Malgun Gothic" w:hAnsi="Malgun Gothic"/>
+                <w:color w:val="0000ff"/>
+                <w:sz w:val="20"/>
+                <w:szCs w:val="20"/>
+                <w:rtl w:val="0"/>
+              </w:rPr>
+              <w:t>v1.0</w:t>
+            </w:r>
+            <w:r>
+              <w:rPr>
+                <w:rtl w:val="0"/>
+              </w:rPr>
+            </w:r>
+          </w:p>
+        </w:tc>
+      </w:tr>
+      <w:tr>
+        <w:trPr>
+          <w:cantSplit w:val="0"/>
+          <w:tblHeader w:val="0"/>
+        </w:trPr>
+        <w:tc>
+          <w:tcPr>
+            <w:tcBorders>
+              <w:top w:color="cccccc" w:space="0" w:sz="8" w:val="single"/>
+              <w:left w:color="cccccc" w:space="0" w:sz="8" w:val="single"/>
+              <w:bottom w:color="cccccc" w:space="0" w:sz="8" w:val="single"/>
+              <w:right w:color="cccccc" w:space="0" w:sz="8" w:val="single"/>
+            </w:tcBorders>
+            <w:shd w:fill="auto" w:val="clear"/>
+            <w:tcMar>
+              <w:top w:w="100.0" w:type="dxa"/>
+              <w:left w:w="100.0" w:type="dxa"/>
+              <w:bottom w:w="100.0" w:type="dxa"/>
+              <w:right w:w="100.0" w:type="dxa"/>
+            </w:tcMar>
+            <w:vAlign w:val="top"/>
+          </w:tcPr>
+          <w:p>
+            <w:pPr>
+              <w:keepNext w:val="0"/>
+              <w:keepLines w:val="0"/>
+              <w:widowControl w:val="0"/>
+              <w:pBdr>
+                <w:top w:space="0" w:sz="0" w:val="nil"/>
+                <w:left w:space="0" w:sz="0" w:val="nil"/>
+                <w:bottom w:space="0" w:sz="0" w:val="nil"/>
+                <w:right w:space="0" w:sz="0" w:val="nil"/>
+                <w:between w:space="0" w:sz="0" w:val="nil"/>
+              </w:pBdr>
+              <w:shd w:fill="auto" w:val="clear"/>
+              <w:spacing w:after="0" w:before="0" w:line="276" w:lineRule="auto"/>
+              <w:ind w:left="0" w:right="0" w:firstLine="0"/>
+              <w:jc w:val="center"/>
+              <w:rPr>
+                <w:rFonts w:ascii="Malgun Gothic" w:cs="Malgun Gothic" w:eastAsia="Malgun Gothic" w:hAnsi="Malgun Gothic"/>
+                <w:b w:val="0"/>
+                <w:bCs w:val="0"/>
+                <w:color w:val="0000ff"/>
+                <w:sz w:val="20"/>
+                <w:szCs w:val="20"/>
+              </w:rPr>
+            </w:pPr>
+            <w:r>
+              <w:rPr>
+                <w:rFonts w:ascii="Malgun Gothic" w:cs="Malgun Gothic" w:eastAsia="Malgun Gothic" w:hAnsi="Malgun Gothic"/>
+                <w:b w:val="0"/>
+                <w:bCs w:val="0"/>
+                <w:color w:val="0000ff"/>
+                <w:sz w:val="20"/>
+                <w:szCs w:val="20"/>
+                <w:rtl w:val="0"/>
+              </w:rPr>
+              <w:t>2026.08.06</w:t>
+            </w:r>
+          </w:p>
+        </w:tc>
+        <w:tc>
+          <w:tcPr>
+            <w:tcBorders>
+              <w:top w:color="cccccc" w:space="0" w:sz="8" w:val="single"/>
+              <w:left w:color="cccccc" w:space="0" w:sz="8" w:val="single"/>
+              <w:bottom w:color="cccccc" w:space="0" w:sz="8" w:val="single"/>
+              <w:right w:color="cccccc" w:space="0" w:sz="8" w:val="single"/>
+            </w:tcBorders>
+            <w:shd w:fill="auto" w:val="clear"/>
+            <w:tcMar>
+              <w:top w:w="100.0" w:type="dxa"/>
+              <w:left w:w="100.0" w:type="dxa"/>
+              <w:bottom w:w="100.0" w:type="dxa"/>
+              <w:right w:w="100.0" w:type="dxa"/>
+            </w:tcMar>
+            <w:vAlign w:val="top"/>
+          </w:tcPr>
+          <w:p>
+            <w:pPr>
+              <w:keepNext w:val="0"/>
+              <w:keepLines w:val="0"/>
+              <w:widowControl w:val="0"/>
+              <w:pBdr>
+                <w:top w:space="0" w:sz="0" w:val="nil"/>
+                <w:left w:space="0" w:sz="0" w:val="nil"/>
+                <w:bottom w:space="0" w:sz="0" w:val="nil"/>
+                <w:right w:space="0" w:sz="0" w:val="nil"/>
+                <w:between w:space="0" w:sz="0" w:val="nil"/>
+              </w:pBdr>
+              <w:shd w:fill="auto" w:val="clear"/>
+              <w:spacing w:after="0" w:before="0" w:line="276" w:lineRule="auto"/>
+              <w:ind w:left="0" w:right="0" w:firstLine="0"/>
+              <w:jc w:val="center"/>
+              <w:rPr>
+                <w:rFonts w:ascii="Malgun Gothic" w:cs="Malgun Gothic" w:eastAsia="Malgun Gothic" w:hAnsi="Malgun Gothic"/>
+                <w:b w:val="0"/>
+                <w:bCs w:val="0"/>
+                <w:color w:val="0000ff"/>
+                <w:sz w:val="20"/>
+                <w:szCs w:val="20"/>
+              </w:rPr>
+            </w:pPr>
+            <w:r>
+              <w:rPr>
+                <w:rFonts w:ascii="Malgun Gothic" w:cs="Malgun Gothic" w:eastAsia="Malgun Gothic" w:hAnsi="Malgun Gothic"/>
+                <w:b w:val="0"/>
+                <w:bCs w:val="0"/>
+                <w:color w:val="0000ff"/>
+                <w:sz w:val="20"/>
+                <w:szCs w:val="20"/>
+                <w:rtl w:val="0"/>
+              </w:rPr>
+              <w:t>이동윤</w:t>
+            </w:r>
+          </w:p>
+        </w:tc>
+        <w:tc>
+          <w:tcPr>
+            <w:tcBorders>
+              <w:top w:color="cccccc" w:space="0" w:sz="8" w:val="single"/>
+              <w:left w:color="cccccc" w:space="0" w:sz="8" w:val="single"/>
+              <w:bottom w:color="cccccc" w:space="0" w:sz="8" w:val="single"/>
+              <w:right w:color="cccccc" w:space="0" w:sz="8" w:val="single"/>
+            </w:tcBorders>
+            <w:shd w:fill="auto" w:val="clear"/>
+            <w:tcMar>
+              <w:top w:w="100.0" w:type="dxa"/>
+              <w:left w:w="100.0" w:type="dxa"/>
+              <w:bottom w:w="100.0" w:type="dxa"/>
+              <w:right w:w="100.0" w:type="dxa"/>
+            </w:tcMar>
+            <w:vAlign w:val="top"/>
+          </w:tcPr>
+          <w:p>
+            <w:pPr>
+              <w:keepNext w:val="0"/>
+              <w:keepLines w:val="0"/>
+              <w:widowControl w:val="0"/>
+              <w:pBdr>
+                <w:top w:space="0" w:sz="0" w:val="nil"/>
+                <w:left w:space="0" w:sz="0" w:val="nil"/>
+                <w:bottom w:space="0" w:sz="0" w:val="nil"/>
+                <w:right w:space="0" w:sz="0" w:val="nil"/>
+                <w:between w:space="0" w:sz="0" w:val="nil"/>
+              </w:pBdr>
+              <w:shd w:fill="auto" w:val="clear"/>
+              <w:spacing w:after="0" w:before="0" w:line="276" w:lineRule="auto"/>
+              <w:ind w:left="0" w:right="0" w:firstLine="0"/>
+              <w:jc w:val="center"/>
+              <w:rPr>
+                <w:rFonts w:ascii="Malgun Gothic" w:cs="Malgun Gothic" w:eastAsia="Malgun Gothic" w:hAnsi="Malgun Gothic"/>
+                <w:b w:val="0"/>
+                <w:bCs w:val="0"/>
+                <w:color w:val="0000ff"/>
+                <w:sz w:val="20"/>
+                <w:szCs w:val="20"/>
+              </w:rPr>
+            </w:pPr>
+            <w:r>
+              <w:rPr>
+                <w:rFonts w:ascii="Malgun Gothic" w:cs="Malgun Gothic" w:eastAsia="Malgun Gothic" w:hAnsi="Malgun Gothic"/>
+                <w:b w:val="0"/>
+                <w:bCs w:val="0"/>
+                <w:color w:val="0000ff"/>
+                <w:sz w:val="20"/>
+                <w:szCs w:val="20"/>
+                <w:rtl w:val="0"/>
+              </w:rPr>
+              <w:t>지정 양식 디자인·표 구조 적용</w:t>
+            </w:r>
+          </w:p>
+        </w:tc>
+        <w:tc>
+          <w:tcPr>
+            <w:tcBorders>
+              <w:top w:color="cccccc" w:space="0" w:sz="8" w:val="single"/>
+              <w:left w:color="cccccc" w:space="0" w:sz="8" w:val="single"/>
+              <w:bottom w:color="cccccc" w:space="0" w:sz="8" w:val="single"/>
+              <w:right w:color="cccccc" w:space="0" w:sz="8" w:val="single"/>
+            </w:tcBorders>
+            <w:shd w:fill="auto" w:val="clear"/>
+            <w:tcMar>
+              <w:top w:w="100.0" w:type="dxa"/>
+              <w:left w:w="100.0" w:type="dxa"/>
+              <w:bottom w:w="100.0" w:type="dxa"/>
+              <w:right w:w="100.0" w:type="dxa"/>
+            </w:tcMar>
+            <w:vAlign w:val="top"/>
+          </w:tcPr>
+          <w:p>
+            <w:pPr>
+              <w:keepNext w:val="0"/>
+              <w:keepLines w:val="0"/>
+              <w:widowControl w:val="0"/>
+              <w:pBdr>
+                <w:top w:space="0" w:sz="0" w:val="nil"/>
+                <w:left w:space="0" w:sz="0" w:val="nil"/>
+                <w:bottom w:space="0" w:sz="0" w:val="nil"/>
+                <w:right w:space="0" w:sz="0" w:val="nil"/>
+                <w:between w:space="0" w:sz="0" w:val="nil"/>
+              </w:pBdr>
+              <w:shd w:fill="auto" w:val="clear"/>
+              <w:spacing w:after="0" w:before="0" w:line="276" w:lineRule="auto"/>
+              <w:ind w:left="0" w:right="0" w:firstLine="0"/>
+              <w:jc w:val="center"/>
+              <w:rPr>
+                <w:rFonts w:ascii="Malgun Gothic" w:cs="Malgun Gothic" w:eastAsia="Malgun Gothic" w:hAnsi="Malgun Gothic"/>
+                <w:b w:val="0"/>
+                <w:bCs w:val="0"/>
+                <w:color w:val="0000ff"/>
+                <w:sz w:val="20"/>
+                <w:szCs w:val="20"/>
+              </w:rPr>
+            </w:pPr>
+            <w:r>
+              <w:rPr>
+                <w:rFonts w:ascii="Malgun Gothic" w:cs="Malgun Gothic" w:eastAsia="Malgun Gothic" w:hAnsi="Malgun Gothic"/>
+                <w:b w:val="0"/>
+                <w:bCs w:val="0"/>
+                <w:color w:val="0000ff"/>
+                <w:sz w:val="20"/>
+                <w:szCs w:val="20"/>
+                <w:rtl w:val="0"/>
+              </w:rPr>
+              <w:t>형식·표</w:t>
+            </w:r>
+          </w:p>
+        </w:tc>
+        <w:tc>
+          <w:tcPr>
+            <w:tcBorders>
+              <w:top w:color="cccccc" w:space="0" w:sz="8" w:val="single"/>
+              <w:left w:color="cccccc" w:space="0" w:sz="8" w:val="single"/>
+              <w:bottom w:color="cccccc" w:space="0" w:sz="8" w:val="single"/>
+              <w:right w:color="cccccc" w:space="0" w:sz="8" w:val="single"/>
+            </w:tcBorders>
+            <w:shd w:fill="auto" w:val="clear"/>
+            <w:tcMar>
+              <w:top w:w="100.0" w:type="dxa"/>
+              <w:left w:w="100.0" w:type="dxa"/>
+              <w:bottom w:w="100.0" w:type="dxa"/>
+              <w:right w:w="100.0" w:type="dxa"/>
+            </w:tcMar>
+            <w:vAlign w:val="top"/>
+          </w:tcPr>
+          <w:p>
+            <w:pPr>
+              <w:keepNext w:val="0"/>
+              <w:keepLines w:val="0"/>
+              <w:widowControl w:val="0"/>
+              <w:pBdr>
+                <w:top w:space="0" w:sz="0" w:val="nil"/>
+                <w:left w:space="0" w:sz="0" w:val="nil"/>
+                <w:bottom w:space="0" w:sz="0" w:val="nil"/>
+                <w:right w:space="0" w:sz="0" w:val="nil"/>
+                <w:between w:space="0" w:sz="0" w:val="nil"/>
+              </w:pBdr>
+              <w:shd w:fill="auto" w:val="clear"/>
+              <w:spacing w:after="0" w:before="0" w:line="276" w:lineRule="auto"/>
+              <w:ind w:left="0" w:right="0" w:firstLine="0"/>
+              <w:jc w:val="center"/>
+              <w:rPr>
+                <w:rFonts w:ascii="Malgun Gothic" w:cs="Malgun Gothic" w:eastAsia="Malgun Gothic" w:hAnsi="Malgun Gothic"/>
+                <w:b w:val="0"/>
+                <w:bCs w:val="0"/>
+                <w:color w:val="0000ff"/>
+                <w:sz w:val="20"/>
+                <w:szCs w:val="20"/>
+              </w:rPr>
+            </w:pPr>
+            <w:r>
+              <w:rPr>
+                <w:rFonts w:ascii="Malgun Gothic" w:cs="Malgun Gothic" w:eastAsia="Malgun Gothic" w:hAnsi="Malgun Gothic"/>
+                <w:color w:val="0000ff"/>
+                <w:sz w:val="20"/>
+                <w:szCs w:val="20"/>
+                <w:rtl w:val="0"/>
+              </w:rPr>
+              <w:t>v1.0-final</w:t>
+            </w:r>
+            <w:r>
+              <w:rPr>
+                <w:rtl w:val="0"/>
+              </w:rPr>
             </w:r>
           </w:p>
         </w:tc>

</xml_diff>